<commit_message>
Chapter 2 Added + Structure of Detector tht identifies Heading, text, Sub-heading
</commit_message>
<xml_diff>
--- a/output/cover_test.docx
+++ b/output/cover_test.docx
@@ -7584,6 +7584,186 @@
         <w:t>The project also provides a strong foundation for future features such as AI-assisted analytics, scheduled data refresh, and collaborative workspaces.</w:t>
       </w:r>
     </w:p>
+    <w:p>
+      <w:r>
+        <w:br w:type="page"/>
+      </w:r>
+    </w:p>
+    <w:p>
+      <w:pPr>
+        <w:spacing w:before="0" w:after="200"/>
+      </w:pPr>
+      <w:r>
+        <w:rPr>
+          <w:rFonts w:ascii="Times New Roman" w:hAnsi="Times New Roman"/>
+          <w:b/>
+          <w:sz w:val="32"/>
+        </w:rPr>
+        <w:t>CHAPTER 2: SURVEY OF TECHNOLOGIES</w:t>
+      </w:r>
+    </w:p>
+    <w:p>
+      <w:pPr>
+        <w:spacing w:before="200" w:after="120"/>
+        <w:ind w:left="360"/>
+      </w:pPr>
+      <w:r>
+        <w:rPr>
+          <w:rFonts w:ascii="Times New Roman" w:hAnsi="Times New Roman"/>
+          <w:b/>
+          <w:sz w:val="28"/>
+        </w:rPr>
+        <w:t>1. Frontend Technologies</w:t>
+      </w:r>
+    </w:p>
+    <w:p>
+      <w:pPr>
+        <w:spacing w:after="160" w:line="276" w:lineRule="auto"/>
+        <w:ind w:firstLine="360"/>
+      </w:pPr>
+      <w:r>
+        <w:rPr>
+          <w:rFonts w:ascii="Times New Roman" w:hAnsi="Times New Roman"/>
+          <w:sz w:val="24"/>
+        </w:rPr>
+        <w:t>Next.js 16 (App Router): React framework for routing, API integration, and server-side rendering. React 19: JavaScript library for building dynamic, reusable UI components. TypeScript 5: Typed superset of JavaScript for static type checking and code reliability. Tailwind CSS 4: Utility-first CSS framework for building a responsive, modern UI. Recharts 3: React charting library for Bar, Line, Pie, Area, and Scatter chart visualisations. React Grid Layout: Enables drag-and-drop customisable dashboard layouts. SheetJS (xlsx): Handles importing and exporting CSV and Excel (.xlsx) files. Lucide React: Open-source icon library used throughout the interface. HTML5 / JSX / TSX: Provides page structure and client-side interactivity.</w:t>
+      </w:r>
+    </w:p>
+    <w:p>
+      <w:pPr>
+        <w:spacing w:before="200" w:after="120"/>
+        <w:ind w:left="360"/>
+      </w:pPr>
+      <w:r>
+        <w:rPr>
+          <w:rFonts w:ascii="Times New Roman" w:hAnsi="Times New Roman"/>
+          <w:b/>
+          <w:sz w:val="28"/>
+        </w:rPr>
+        <w:t>2. Backend Technologies</w:t>
+      </w:r>
+    </w:p>
+    <w:p>
+      <w:pPr>
+        <w:spacing w:after="160" w:line="276" w:lineRule="auto"/>
+        <w:ind w:firstLine="360"/>
+      </w:pPr>
+      <w:r>
+        <w:rPr>
+          <w:rFonts w:ascii="Times New Roman" w:hAnsi="Times New Roman"/>
+          <w:sz w:val="24"/>
+        </w:rPr>
+        <w:t>Python 3.10: Primary backend language for API development and data processing. FastAPI: High-performance framework for building RESTful APIs. DuckDB ≥ 1.1: Core analytical engine; runs all profiling, cleaning, and aggregation as SQL without loading data into memory, supporting files up to 200 MB. Pandas &amp; openpyxl: Used only to convert Excel files into a DuckDB-ingestible format. Uvicorn: ASGI server used to run the FastAPI application. Pydantic ≥ 2: Validates all API request and response data. python-dotenv: Loads environment variables securely from a .env file.</w:t>
+      </w:r>
+    </w:p>
+    <w:p>
+      <w:pPr>
+        <w:spacing w:before="200" w:after="120"/>
+        <w:ind w:left="360"/>
+      </w:pPr>
+      <w:r>
+        <w:rPr>
+          <w:rFonts w:ascii="Times New Roman" w:hAnsi="Times New Roman"/>
+          <w:b/>
+          <w:sz w:val="28"/>
+        </w:rPr>
+        <w:t>3. Database Technologies</w:t>
+      </w:r>
+    </w:p>
+    <w:p>
+      <w:pPr>
+        <w:spacing w:after="160" w:line="276" w:lineRule="auto"/>
+        <w:ind w:firstLine="360"/>
+      </w:pPr>
+      <w:r>
+        <w:rPr>
+          <w:rFonts w:ascii="Times New Roman" w:hAnsi="Times New Roman"/>
+          <w:sz w:val="24"/>
+        </w:rPr>
+        <w:t>PostgreSQL: Relational database for storing users, projects, and application metadata in production. SQLite: Zero-configuration default database for local development. SQLAlchemy: Python ORM for database operations without writing raw SQL. psycopg2-binary: PostgreSQL adapter connecting SQLAlchemy to the database.</w:t>
+      </w:r>
+    </w:p>
+    <w:p>
+      <w:pPr>
+        <w:spacing w:before="200" w:after="120"/>
+        <w:ind w:left="360"/>
+      </w:pPr>
+      <w:r>
+        <w:rPr>
+          <w:rFonts w:ascii="Times New Roman" w:hAnsi="Times New Roman"/>
+          <w:b/>
+          <w:sz w:val="28"/>
+        </w:rPr>
+        <w:t>4. Authentication Technologies</w:t>
+      </w:r>
+    </w:p>
+    <w:p>
+      <w:pPr>
+        <w:spacing w:after="160" w:line="276" w:lineRule="auto"/>
+        <w:ind w:firstLine="360"/>
+      </w:pPr>
+      <w:r>
+        <w:rPr>
+          <w:rFonts w:ascii="Times New Roman" w:hAnsi="Times New Roman"/>
+          <w:sz w:val="24"/>
+        </w:rPr>
+        <w:t>Google OAuth 2.0 &amp; google-auth: Secure user authentication via Google accounts. Google Identity Services (GIS): Manages the client-side Google Sign-In flow. python-jose (JWT): Issues and validates signed session tokens.</w:t>
+      </w:r>
+    </w:p>
+    <w:p>
+      <w:pPr>
+        <w:spacing w:before="200" w:after="120"/>
+        <w:ind w:left="360"/>
+      </w:pPr>
+      <w:r>
+        <w:rPr>
+          <w:rFonts w:ascii="Times New Roman" w:hAnsi="Times New Roman"/>
+          <w:b/>
+          <w:sz w:val="28"/>
+        </w:rPr>
+        <w:t>5. Version Control</w:t>
+      </w:r>
+    </w:p>
+    <w:p>
+      <w:pPr>
+        <w:spacing w:after="160" w:line="276" w:lineRule="auto"/>
+        <w:ind w:firstLine="360"/>
+      </w:pPr>
+      <w:r>
+        <w:rPr>
+          <w:rFonts w:ascii="Times New Roman" w:hAnsi="Times New Roman"/>
+          <w:sz w:val="24"/>
+        </w:rPr>
+        <w:t>Git: Tracks all source code changes across the project. GitHub: Hosts the remote repository and manages version control.</w:t>
+      </w:r>
+    </w:p>
+    <w:p>
+      <w:pPr>
+        <w:spacing w:before="200" w:after="120"/>
+        <w:ind w:left="360"/>
+      </w:pPr>
+      <w:r>
+        <w:rPr>
+          <w:rFonts w:ascii="Times New Roman" w:hAnsi="Times New Roman"/>
+          <w:b/>
+          <w:sz w:val="28"/>
+        </w:rPr>
+        <w:t>6. Development Tools</w:t>
+      </w:r>
+    </w:p>
+    <w:p>
+      <w:pPr>
+        <w:spacing w:after="160" w:line="276" w:lineRule="auto"/>
+        <w:ind w:firstLine="360"/>
+      </w:pPr>
+      <w:r>
+        <w:rPr>
+          <w:rFonts w:ascii="Times New Roman" w:hAnsi="Times New Roman"/>
+          <w:sz w:val="24"/>
+        </w:rPr>
+        <w:t>Node.js &amp; npm: Runs the development server and manages frontend dependencies. ESLint 9: Enforces code quality and Next.js coding standards. PostCSS &amp; @tailwindcss/postcss: Compiles Tailwind CSS into browser-compatible styles.</w:t>
+      </w:r>
+    </w:p>
     <w:sectPr>
       <w:footerReference w:type="default" r:id="rId9"/>
       <w:pgSz w:w="11906" w:h="16838"/>

</xml_diff>

<commit_message>
Add plain-text structure detector: auto-detects chapters, sections, subsections, roman-numeral requirements, and tables from raw text
</commit_message>
<xml_diff>
--- a/output/cover_test.docx
+++ b/output/cover_test.docx
@@ -7764,6 +7764,754 @@
         <w:t>Node.js &amp; npm: Runs the development server and manages frontend dependencies. ESLint 9: Enforces code quality and Next.js coding standards. PostCSS &amp; @tailwindcss/postcss: Compiles Tailwind CSS into browser-compatible styles.</w:t>
       </w:r>
     </w:p>
+    <w:p>
+      <w:r>
+        <w:br w:type="page"/>
+      </w:r>
+    </w:p>
+    <w:p>
+      <w:pPr>
+        <w:spacing w:before="0" w:after="200"/>
+      </w:pPr>
+      <w:r>
+        <w:rPr>
+          <w:rFonts w:ascii="Times New Roman" w:hAnsi="Times New Roman"/>
+          <w:b/>
+          <w:sz w:val="32"/>
+        </w:rPr>
+        <w:t>CHAPTER 3: REQUIREMENT AND ANALYSIS</w:t>
+      </w:r>
+    </w:p>
+    <w:p>
+      <w:pPr>
+        <w:spacing w:before="0" w:after="200"/>
+      </w:pPr>
+      <w:r>
+        <w:rPr>
+          <w:rFonts w:ascii="Times New Roman" w:hAnsi="Times New Roman"/>
+          <w:b/>
+          <w:sz w:val="24"/>
+        </w:rPr>
+        <w:t>3.1.1 Problem Definition</w:t>
+      </w:r>
+    </w:p>
+    <w:p>
+      <w:pPr>
+        <w:spacing w:after="160" w:line="276" w:lineRule="auto"/>
+        <w:ind w:firstLine="360"/>
+      </w:pPr>
+      <w:r>
+        <w:rPr>
+          <w:rFonts w:ascii="Times New Roman" w:hAnsi="Times New Roman"/>
+          <w:sz w:val="24"/>
+        </w:rPr>
+        <w:t>Organisations and analysts working with data frequently receive raw datasets in CSV or Excel format that contain missing values, duplicate records, inconsistent data types, and outliers. Cleaning this data manually using spreadsheet tools or custom scripts is time-consuming, error-prone, and requires technical expertise. There is no straightforward way to profile a dataset, understand its quality issues, apply corrections, and visualise insights—all within a single platform. There is therefore a need for a unified, web-based tool that automates data profiling, detects quality issues, applies cleaning operations, and presents results through interactive dashboards without requiring users to write code.</w:t>
+      </w:r>
+    </w:p>
+    <w:p>
+      <w:pPr>
+        <w:spacing w:before="0" w:after="200"/>
+      </w:pPr>
+      <w:r>
+        <w:rPr>
+          <w:rFonts w:ascii="Times New Roman" w:hAnsi="Times New Roman"/>
+          <w:b/>
+          <w:sz w:val="24"/>
+        </w:rPr>
+        <w:t>3.1.2 Existing System</w:t>
+      </w:r>
+    </w:p>
+    <w:p>
+      <w:pPr>
+        <w:spacing w:after="160" w:line="276" w:lineRule="auto"/>
+        <w:ind w:firstLine="360"/>
+      </w:pPr>
+      <w:r>
+        <w:rPr>
+          <w:rFonts w:ascii="Times New Roman" w:hAnsi="Times New Roman"/>
+          <w:sz w:val="24"/>
+        </w:rPr>
+        <w:t>Most data cleaning today is done using spreadsheet applications such as Microsoft Excel or Google Sheets, which offer no automated profiling, no outlier detection, and no audit trail of changes made. Advanced users rely on Python scripts using Pandas, which requires programming knowledge and offers no graphical interface or built-in visualisation. Dedicated BI tools like Power BI or Tableau focus on visualisation but provide limited data cleaning capabilities and cannot handle the cleaning workflow end to end. None of these solutions combine automated quality analysis, one-click cleaning operations, and drag-and-drop dashboards in a single accessible platform. Large file sizes also remain a bottleneck, as most tools attempt to load entire datasets into memory.</w:t>
+      </w:r>
+    </w:p>
+    <w:p>
+      <w:pPr>
+        <w:spacing w:before="0" w:after="200"/>
+      </w:pPr>
+      <w:r>
+        <w:rPr>
+          <w:rFonts w:ascii="Times New Roman" w:hAnsi="Times New Roman"/>
+          <w:b/>
+          <w:sz w:val="24"/>
+        </w:rPr>
+        <w:t>3.1.3 Proposed System</w:t>
+      </w:r>
+    </w:p>
+    <w:p>
+      <w:pPr>
+        <w:spacing w:after="160" w:line="276" w:lineRule="auto"/>
+        <w:ind w:firstLine="360"/>
+      </w:pPr>
+      <w:r>
+        <w:rPr>
+          <w:rFonts w:ascii="Times New Roman" w:hAnsi="Times New Roman"/>
+          <w:sz w:val="24"/>
+        </w:rPr>
+        <w:t>Cleanlytics is a web-based data cleaning and analytics platform that allows users to upload CSV and Excel files, automatically profile their datasets, detect quality issues, apply cleaning operations, and build interactive dashboards—all without writing code. The system organises work into projects, each backed by an embedded DuckDB analytical database so that files up to 200 MB can be processed without loading data into memory. A FastAPI backend exposes a RESTful API consumed by a Next.js frontend. Users authenticate via Google OAuth and can manage multiple datasets per project, view per-column statistics, fix issues (missing values, duplicates, outliers, type errors) with a single click, detect relationships between tables, and publish charts on a customisable drag-and-drop dashboard.</w:t>
+      </w:r>
+    </w:p>
+    <w:p>
+      <w:r>
+        <w:br w:type="page"/>
+      </w:r>
+    </w:p>
+    <w:p>
+      <w:pPr>
+        <w:spacing w:before="0" w:after="200"/>
+      </w:pPr>
+      <w:r>
+        <w:rPr>
+          <w:rFonts w:ascii="Times New Roman" w:hAnsi="Times New Roman"/>
+          <w:b/>
+          <w:sz w:val="28"/>
+        </w:rPr>
+        <w:t>3.2 Requirement Specification</w:t>
+      </w:r>
+    </w:p>
+    <w:p>
+      <w:pPr>
+        <w:spacing w:before="200" w:after="120"/>
+        <w:ind w:left="360"/>
+      </w:pPr>
+      <w:r>
+        <w:rPr>
+          <w:rFonts w:ascii="Times New Roman" w:hAnsi="Times New Roman"/>
+          <w:b/>
+          <w:sz w:val="28"/>
+        </w:rPr>
+        <w:t>Functional Requirements</w:t>
+      </w:r>
+    </w:p>
+    <w:p>
+      <w:pPr>
+        <w:spacing w:after="160" w:line="276" w:lineRule="auto"/>
+        <w:ind w:left="360" w:hanging="360"/>
+      </w:pPr>
+      <w:r>
+        <w:rPr>
+          <w:rFonts w:ascii="Times New Roman" w:hAnsi="Times New Roman"/>
+          <w:b/>
+          <w:sz w:val="24"/>
+        </w:rPr>
+        <w:t xml:space="preserve">I. User Authentication </w:t>
+      </w:r>
+      <w:r>
+        <w:rPr>
+          <w:rFonts w:ascii="Times New Roman" w:hAnsi="Times New Roman"/>
+          <w:sz w:val="24"/>
+        </w:rPr>
+        <w:t>The system must allow secure login via Google OAuth 2.0 with JWT-based session management and role-based access so that each user sees only their own projects and data.</w:t>
+      </w:r>
+    </w:p>
+    <w:p>
+      <w:pPr>
+        <w:spacing w:after="160" w:line="276" w:lineRule="auto"/>
+        <w:ind w:left="360" w:hanging="360"/>
+      </w:pPr>
+      <w:r>
+        <w:rPr>
+          <w:rFonts w:ascii="Times New Roman" w:hAnsi="Times New Roman"/>
+          <w:b/>
+          <w:sz w:val="24"/>
+        </w:rPr>
+        <w:t xml:space="preserve">II. File Upload &amp; Ingestion </w:t>
+      </w:r>
+      <w:r>
+        <w:rPr>
+          <w:rFonts w:ascii="Times New Roman" w:hAnsi="Times New Roman"/>
+          <w:sz w:val="24"/>
+        </w:rPr>
+        <w:t>Users must be able to upload CSV and Excel (.xlsx) files up to 200 MB. Multi-sheet workbooks must be split into individual tables automatically.</w:t>
+      </w:r>
+    </w:p>
+    <w:p>
+      <w:pPr>
+        <w:spacing w:after="160" w:line="276" w:lineRule="auto"/>
+        <w:ind w:left="360" w:hanging="360"/>
+      </w:pPr>
+      <w:r>
+        <w:rPr>
+          <w:rFonts w:ascii="Times New Roman" w:hAnsi="Times New Roman"/>
+          <w:b/>
+          <w:sz w:val="24"/>
+        </w:rPr>
+        <w:t xml:space="preserve">III. Automated Data Profiling </w:t>
+      </w:r>
+      <w:r>
+        <w:rPr>
+          <w:rFonts w:ascii="Times New Roman" w:hAnsi="Times New Roman"/>
+          <w:sz w:val="24"/>
+        </w:rPr>
+        <w:t>The system must compute per-column statistics (null rate, distinct count, min, max, mean, top values, inferred type) and a composite quality score for every uploaded table.</w:t>
+      </w:r>
+    </w:p>
+    <w:p>
+      <w:pPr>
+        <w:spacing w:after="160" w:line="276" w:lineRule="auto"/>
+        <w:ind w:left="360" w:hanging="360"/>
+      </w:pPr>
+      <w:r>
+        <w:rPr>
+          <w:rFonts w:ascii="Times New Roman" w:hAnsi="Times New Roman"/>
+          <w:b/>
+          <w:sz w:val="24"/>
+        </w:rPr>
+        <w:t xml:space="preserve">IV. Quality Issue Detection </w:t>
+      </w:r>
+      <w:r>
+        <w:rPr>
+          <w:rFonts w:ascii="Times New Roman" w:hAnsi="Times New Roman"/>
+          <w:sz w:val="24"/>
+        </w:rPr>
+        <w:t>The system must automatically identify missing values, duplicate rows, type mismatches, and outliers and present them as actionable findings with suggested repairs.</w:t>
+      </w:r>
+    </w:p>
+    <w:p>
+      <w:pPr>
+        <w:spacing w:after="160" w:line="276" w:lineRule="auto"/>
+        <w:ind w:left="360" w:hanging="360"/>
+      </w:pPr>
+      <w:r>
+        <w:rPr>
+          <w:rFonts w:ascii="Times New Roman" w:hAnsi="Times New Roman"/>
+          <w:b/>
+          <w:sz w:val="24"/>
+        </w:rPr>
+        <w:t xml:space="preserve">V. Data Cleaning Operations </w:t>
+      </w:r>
+      <w:r>
+        <w:rPr>
+          <w:rFonts w:ascii="Times New Roman" w:hAnsi="Times New Roman"/>
+          <w:sz w:val="24"/>
+        </w:rPr>
+        <w:t>Users must be able to apply cleaning operations (imputation, deduplication, type casting, column renaming, outlier removal, row filtering) with one click. Destructive operations must be reversible via undo.</w:t>
+      </w:r>
+    </w:p>
+    <w:p>
+      <w:pPr>
+        <w:spacing w:after="160" w:line="276" w:lineRule="auto"/>
+        <w:ind w:left="360" w:hanging="360"/>
+      </w:pPr>
+      <w:r>
+        <w:rPr>
+          <w:rFonts w:ascii="Times New Roman" w:hAnsi="Times New Roman"/>
+          <w:b/>
+          <w:sz w:val="24"/>
+        </w:rPr>
+        <w:t xml:space="preserve">VI. Relationship Detection </w:t>
+      </w:r>
+      <w:r>
+        <w:rPr>
+          <w:rFonts w:ascii="Times New Roman" w:hAnsi="Times New Roman"/>
+          <w:sz w:val="24"/>
+        </w:rPr>
+        <w:t>The system must detect and display foreign-key relationships between tables in a project based on column name similarity and value overlap.</w:t>
+      </w:r>
+    </w:p>
+    <w:p>
+      <w:pPr>
+        <w:spacing w:after="160" w:line="276" w:lineRule="auto"/>
+        <w:ind w:left="360" w:hanging="360"/>
+      </w:pPr>
+      <w:r>
+        <w:rPr>
+          <w:rFonts w:ascii="Times New Roman" w:hAnsi="Times New Roman"/>
+          <w:b/>
+          <w:sz w:val="24"/>
+        </w:rPr>
+        <w:t xml:space="preserve">VII. Dashboard Builder </w:t>
+      </w:r>
+      <w:r>
+        <w:rPr>
+          <w:rFonts w:ascii="Times New Roman" w:hAnsi="Times New Roman"/>
+          <w:sz w:val="24"/>
+        </w:rPr>
+        <w:t>Users must be able to create interactive charts (Bar, Line, Pie, Area, Scatter) and arrange them on a drag-and-drop grid that persists across sessions.</w:t>
+      </w:r>
+    </w:p>
+    <w:p>
+      <w:pPr>
+        <w:spacing w:after="160" w:line="276" w:lineRule="auto"/>
+        <w:ind w:left="360" w:hanging="360"/>
+      </w:pPr>
+      <w:r>
+        <w:rPr>
+          <w:rFonts w:ascii="Times New Roman" w:hAnsi="Times New Roman"/>
+          <w:b/>
+          <w:sz w:val="24"/>
+        </w:rPr>
+        <w:t xml:space="preserve">VIII. Data Export </w:t>
+      </w:r>
+      <w:r>
+        <w:rPr>
+          <w:rFonts w:ascii="Times New Roman" w:hAnsi="Times New Roman"/>
+          <w:sz w:val="24"/>
+        </w:rPr>
+        <w:t>Users must be able to download cleaned datasets as CSV or Excel files.</w:t>
+      </w:r>
+    </w:p>
+    <w:p>
+      <w:pPr>
+        <w:spacing w:after="160" w:line="276" w:lineRule="auto"/>
+        <w:ind w:left="360" w:hanging="360"/>
+      </w:pPr>
+      <w:r>
+        <w:rPr>
+          <w:rFonts w:ascii="Times New Roman" w:hAnsi="Times New Roman"/>
+          <w:b/>
+          <w:sz w:val="24"/>
+        </w:rPr>
+        <w:t xml:space="preserve">IX. Responsive Design </w:t>
+      </w:r>
+      <w:r>
+        <w:rPr>
+          <w:rFonts w:ascii="Times New Roman" w:hAnsi="Times New Roman"/>
+          <w:sz w:val="24"/>
+        </w:rPr>
+        <w:t>The platform must function correctly across desktop and tablet browsers.</w:t>
+      </w:r>
+    </w:p>
+    <w:p>
+      <w:pPr>
+        <w:spacing w:before="200" w:after="120"/>
+        <w:ind w:left="360"/>
+      </w:pPr>
+      <w:r>
+        <w:rPr>
+          <w:rFonts w:ascii="Times New Roman" w:hAnsi="Times New Roman"/>
+          <w:b/>
+          <w:sz w:val="28"/>
+        </w:rPr>
+        <w:t>Non-Functional Requirements</w:t>
+      </w:r>
+    </w:p>
+    <w:tbl>
+      <w:tblPr>
+        <w:tblStyle w:val="TableGrid"/>
+        <w:tblW w:type="auto" w:w="0"/>
+        <w:tblLook w:firstColumn="1" w:firstRow="1" w:lastColumn="0" w:lastRow="0" w:noHBand="0" w:noVBand="1" w:val="04A0"/>
+      </w:tblPr>
+      <w:tblGrid>
+        <w:gridCol w:w="3402"/>
+        <w:gridCol w:w="3402"/>
+        <w:gridCol w:w="3402"/>
+      </w:tblGrid>
+      <w:tr>
+        <w:tc>
+          <w:tcPr>
+            <w:tcW w:type="dxa" w:w="3402"/>
+          </w:tcPr>
+          <w:p>
+            <w:r/>
+            <w:r>
+              <w:rPr>
+                <w:rFonts w:ascii="Times New Roman" w:hAnsi="Times New Roman"/>
+                <w:b/>
+                <w:sz w:val="24"/>
+              </w:rPr>
+              <w:t>#</w:t>
+            </w:r>
+          </w:p>
+        </w:tc>
+        <w:tc>
+          <w:tcPr>
+            <w:tcW w:type="dxa" w:w="3402"/>
+          </w:tcPr>
+          <w:p>
+            <w:r/>
+            <w:r>
+              <w:rPr>
+                <w:rFonts w:ascii="Times New Roman" w:hAnsi="Times New Roman"/>
+                <w:b/>
+                <w:sz w:val="24"/>
+              </w:rPr>
+              <w:t>Requirement</w:t>
+            </w:r>
+          </w:p>
+        </w:tc>
+        <w:tc>
+          <w:tcPr>
+            <w:tcW w:type="dxa" w:w="3402"/>
+          </w:tcPr>
+          <w:p>
+            <w:r/>
+            <w:r>
+              <w:rPr>
+                <w:rFonts w:ascii="Times New Roman" w:hAnsi="Times New Roman"/>
+                <w:b/>
+                <w:sz w:val="24"/>
+              </w:rPr>
+              <w:t>Description</w:t>
+            </w:r>
+          </w:p>
+        </w:tc>
+      </w:tr>
+      <w:tr>
+        <w:tc>
+          <w:tcPr>
+            <w:tcW w:type="dxa" w:w="3402"/>
+          </w:tcPr>
+          <w:p>
+            <w:r/>
+            <w:r>
+              <w:rPr>
+                <w:rFonts w:ascii="Times New Roman" w:hAnsi="Times New Roman"/>
+                <w:b w:val="0"/>
+                <w:sz w:val="24"/>
+              </w:rPr>
+              <w:t>I</w:t>
+            </w:r>
+          </w:p>
+        </w:tc>
+        <w:tc>
+          <w:tcPr>
+            <w:tcW w:type="dxa" w:w="3402"/>
+          </w:tcPr>
+          <w:p>
+            <w:r/>
+            <w:r>
+              <w:rPr>
+                <w:rFonts w:ascii="Times New Roman" w:hAnsi="Times New Roman"/>
+                <w:b w:val="0"/>
+                <w:sz w:val="24"/>
+              </w:rPr>
+              <w:t>Performance</w:t>
+            </w:r>
+          </w:p>
+        </w:tc>
+        <w:tc>
+          <w:tcPr>
+            <w:tcW w:type="dxa" w:w="3402"/>
+          </w:tcPr>
+          <w:p>
+            <w:r/>
+            <w:r>
+              <w:rPr>
+                <w:rFonts w:ascii="Times New Roman" w:hAnsi="Times New Roman"/>
+                <w:b w:val="0"/>
+                <w:sz w:val="24"/>
+              </w:rPr>
+              <w:t>Large files (up to 200 MB) must be profiled and cleaned without significant delays by executing all analytics inside DuckDB rather than loading data into Python memory.</w:t>
+            </w:r>
+          </w:p>
+        </w:tc>
+      </w:tr>
+      <w:tr>
+        <w:tc>
+          <w:tcPr>
+            <w:tcW w:type="dxa" w:w="3402"/>
+          </w:tcPr>
+          <w:p>
+            <w:r/>
+            <w:r>
+              <w:rPr>
+                <w:rFonts w:ascii="Times New Roman" w:hAnsi="Times New Roman"/>
+                <w:b w:val="0"/>
+                <w:sz w:val="24"/>
+              </w:rPr>
+              <w:t>II</w:t>
+            </w:r>
+          </w:p>
+        </w:tc>
+        <w:tc>
+          <w:tcPr>
+            <w:tcW w:type="dxa" w:w="3402"/>
+          </w:tcPr>
+          <w:p>
+            <w:r/>
+            <w:r>
+              <w:rPr>
+                <w:rFonts w:ascii="Times New Roman" w:hAnsi="Times New Roman"/>
+                <w:b w:val="0"/>
+                <w:sz w:val="24"/>
+              </w:rPr>
+              <w:t>Scalability</w:t>
+            </w:r>
+          </w:p>
+        </w:tc>
+        <w:tc>
+          <w:tcPr>
+            <w:tcW w:type="dxa" w:w="3402"/>
+          </w:tcPr>
+          <w:p>
+            <w:r/>
+            <w:r>
+              <w:rPr>
+                <w:rFonts w:ascii="Times New Roman" w:hAnsi="Times New Roman"/>
+                <w:b w:val="0"/>
+                <w:sz w:val="24"/>
+              </w:rPr>
+              <w:t>The system must support multiple concurrent users, each with isolated project workspaces.</w:t>
+            </w:r>
+          </w:p>
+        </w:tc>
+      </w:tr>
+      <w:tr>
+        <w:tc>
+          <w:tcPr>
+            <w:tcW w:type="dxa" w:w="3402"/>
+          </w:tcPr>
+          <w:p>
+            <w:r/>
+            <w:r>
+              <w:rPr>
+                <w:rFonts w:ascii="Times New Roman" w:hAnsi="Times New Roman"/>
+                <w:b w:val="0"/>
+                <w:sz w:val="24"/>
+              </w:rPr>
+              <w:t>III</w:t>
+            </w:r>
+          </w:p>
+        </w:tc>
+        <w:tc>
+          <w:tcPr>
+            <w:tcW w:type="dxa" w:w="3402"/>
+          </w:tcPr>
+          <w:p>
+            <w:r/>
+            <w:r>
+              <w:rPr>
+                <w:rFonts w:ascii="Times New Roman" w:hAnsi="Times New Roman"/>
+                <w:b w:val="0"/>
+                <w:sz w:val="24"/>
+              </w:rPr>
+              <w:t>Security</w:t>
+            </w:r>
+          </w:p>
+        </w:tc>
+        <w:tc>
+          <w:tcPr>
+            <w:tcW w:type="dxa" w:w="3402"/>
+          </w:tcPr>
+          <w:p>
+            <w:r/>
+            <w:r>
+              <w:rPr>
+                <w:rFonts w:ascii="Times New Roman" w:hAnsi="Times New Roman"/>
+                <w:b w:val="0"/>
+                <w:sz w:val="24"/>
+              </w:rPr>
+              <w:t>User data must be protected with Google OAuth 2.0 authentication, signed JWT tokens, and environment-based secret management.</w:t>
+            </w:r>
+          </w:p>
+        </w:tc>
+      </w:tr>
+      <w:tr>
+        <w:tc>
+          <w:tcPr>
+            <w:tcW w:type="dxa" w:w="3402"/>
+          </w:tcPr>
+          <w:p>
+            <w:r/>
+            <w:r>
+              <w:rPr>
+                <w:rFonts w:ascii="Times New Roman" w:hAnsi="Times New Roman"/>
+                <w:b w:val="0"/>
+                <w:sz w:val="24"/>
+              </w:rPr>
+              <w:t>IV</w:t>
+            </w:r>
+          </w:p>
+        </w:tc>
+        <w:tc>
+          <w:tcPr>
+            <w:tcW w:type="dxa" w:w="3402"/>
+          </w:tcPr>
+          <w:p>
+            <w:r/>
+            <w:r>
+              <w:rPr>
+                <w:rFonts w:ascii="Times New Roman" w:hAnsi="Times New Roman"/>
+                <w:b w:val="0"/>
+                <w:sz w:val="24"/>
+              </w:rPr>
+              <w:t>Usability</w:t>
+            </w:r>
+          </w:p>
+        </w:tc>
+        <w:tc>
+          <w:tcPr>
+            <w:tcW w:type="dxa" w:w="3402"/>
+          </w:tcPr>
+          <w:p>
+            <w:r/>
+            <w:r>
+              <w:rPr>
+                <w:rFonts w:ascii="Times New Roman" w:hAnsi="Times New Roman"/>
+                <w:b w:val="0"/>
+                <w:sz w:val="24"/>
+              </w:rPr>
+              <w:t>The interface must allow non-technical users to clean and visualise data without writing any code.</w:t>
+            </w:r>
+          </w:p>
+        </w:tc>
+      </w:tr>
+      <w:tr>
+        <w:tc>
+          <w:tcPr>
+            <w:tcW w:type="dxa" w:w="3402"/>
+          </w:tcPr>
+          <w:p>
+            <w:r/>
+            <w:r>
+              <w:rPr>
+                <w:rFonts w:ascii="Times New Roman" w:hAnsi="Times New Roman"/>
+                <w:b w:val="0"/>
+                <w:sz w:val="24"/>
+              </w:rPr>
+              <w:t>V</w:t>
+            </w:r>
+          </w:p>
+        </w:tc>
+        <w:tc>
+          <w:tcPr>
+            <w:tcW w:type="dxa" w:w="3402"/>
+          </w:tcPr>
+          <w:p>
+            <w:r/>
+            <w:r>
+              <w:rPr>
+                <w:rFonts w:ascii="Times New Roman" w:hAnsi="Times New Roman"/>
+                <w:b w:val="0"/>
+                <w:sz w:val="24"/>
+              </w:rPr>
+              <w:t>Reliability</w:t>
+            </w:r>
+          </w:p>
+        </w:tc>
+        <w:tc>
+          <w:tcPr>
+            <w:tcW w:type="dxa" w:w="3402"/>
+          </w:tcPr>
+          <w:p>
+            <w:r/>
+            <w:r>
+              <w:rPr>
+                <w:rFonts w:ascii="Times New Roman" w:hAnsi="Times New Roman"/>
+                <w:b w:val="0"/>
+                <w:sz w:val="24"/>
+              </w:rPr>
+              <w:t>The application must handle errors gracefully with clear feedback and maintain data integrity through transactional database operations.</w:t>
+            </w:r>
+          </w:p>
+        </w:tc>
+      </w:tr>
+      <w:tr>
+        <w:tc>
+          <w:tcPr>
+            <w:tcW w:type="dxa" w:w="3402"/>
+          </w:tcPr>
+          <w:p>
+            <w:r/>
+            <w:r>
+              <w:rPr>
+                <w:rFonts w:ascii="Times New Roman" w:hAnsi="Times New Roman"/>
+                <w:b w:val="0"/>
+                <w:sz w:val="24"/>
+              </w:rPr>
+              <w:t>VI</w:t>
+            </w:r>
+          </w:p>
+        </w:tc>
+        <w:tc>
+          <w:tcPr>
+            <w:tcW w:type="dxa" w:w="3402"/>
+          </w:tcPr>
+          <w:p>
+            <w:r/>
+            <w:r>
+              <w:rPr>
+                <w:rFonts w:ascii="Times New Roman" w:hAnsi="Times New Roman"/>
+                <w:b w:val="0"/>
+                <w:sz w:val="24"/>
+              </w:rPr>
+              <w:t>Maintainability</w:t>
+            </w:r>
+          </w:p>
+        </w:tc>
+        <w:tc>
+          <w:tcPr>
+            <w:tcW w:type="dxa" w:w="3402"/>
+          </w:tcPr>
+          <w:p>
+            <w:r/>
+            <w:r>
+              <w:rPr>
+                <w:rFonts w:ascii="Times New Roman" w:hAnsi="Times New Roman"/>
+                <w:b w:val="0"/>
+                <w:sz w:val="24"/>
+              </w:rPr>
+              <w:t>The codebase must be modular, fully typed (TypeScript on the frontend, Pydantic on the backend), and clearly documented for easy updates.</w:t>
+            </w:r>
+          </w:p>
+        </w:tc>
+      </w:tr>
+      <w:tr>
+        <w:tc>
+          <w:tcPr>
+            <w:tcW w:type="dxa" w:w="3402"/>
+          </w:tcPr>
+          <w:p>
+            <w:r/>
+            <w:r>
+              <w:rPr>
+                <w:rFonts w:ascii="Times New Roman" w:hAnsi="Times New Roman"/>
+                <w:b w:val="0"/>
+                <w:sz w:val="24"/>
+              </w:rPr>
+              <w:t>VII</w:t>
+            </w:r>
+          </w:p>
+        </w:tc>
+        <w:tc>
+          <w:tcPr>
+            <w:tcW w:type="dxa" w:w="3402"/>
+          </w:tcPr>
+          <w:p>
+            <w:r/>
+            <w:r>
+              <w:rPr>
+                <w:rFonts w:ascii="Times New Roman" w:hAnsi="Times New Roman"/>
+                <w:b w:val="0"/>
+                <w:sz w:val="24"/>
+              </w:rPr>
+              <w:t>Compatibility</w:t>
+            </w:r>
+          </w:p>
+        </w:tc>
+        <w:tc>
+          <w:tcPr>
+            <w:tcW w:type="dxa" w:w="3402"/>
+          </w:tcPr>
+          <w:p>
+            <w:r/>
+            <w:r>
+              <w:rPr>
+                <w:rFonts w:ascii="Times New Roman" w:hAnsi="Times New Roman"/>
+                <w:b w:val="0"/>
+                <w:sz w:val="24"/>
+              </w:rPr>
+              <w:t>The application must be compatible with modern browsers and support both PostgreSQL (production) and SQLite (local development) with no code changes.</w:t>
+            </w:r>
+          </w:p>
+        </w:tc>
+      </w:tr>
+    </w:tbl>
+    <w:p>
+      <w:pPr>
+        <w:spacing w:after="80"/>
+      </w:pPr>
+    </w:p>
     <w:sectPr>
       <w:footerReference w:type="default" r:id="rId9"/>
       <w:pgSz w:w="11906" w:h="16838"/>

</xml_diff>

<commit_message>
Autamed image and figure numbering
</commit_message>
<xml_diff>
--- a/output/cover_test.docx
+++ b/output/cover_test.docx
@@ -7134,137 +7134,7 @@
           <w:rFonts w:ascii="Times New Roman" w:hAnsi="Times New Roman"/>
           <w:sz w:val="24"/>
         </w:rPr>
-        <w:t>Cleanlytics successfully integrates data ingestion, profiling, cleaning, relationship detection, semantic modelling, analytics, and visualization into one platform.</w:t>
-      </w:r>
-    </w:p>
-    <w:p>
-      <w:pPr>
-        <w:spacing w:after="160" w:line="276" w:lineRule="auto"/>
-        <w:ind w:firstLine="360"/>
-      </w:pPr>
-      <w:r>
-        <w:rPr>
-          <w:rFonts w:ascii="Times New Roman" w:hAnsi="Times New Roman"/>
-          <w:sz w:val="24"/>
-        </w:rPr>
-        <w:t>Major achievements include:</w:t>
-      </w:r>
-    </w:p>
-    <w:p>
-      <w:pPr>
-        <w:pStyle w:val="ListBullet"/>
-        <w:spacing w:after="80"/>
-      </w:pPr>
-      <w:r>
-        <w:rPr>
-          <w:rFonts w:ascii="Times New Roman" w:hAnsi="Times New Roman"/>
-          <w:sz w:val="24"/>
-        </w:rPr>
-        <w:t>Server-side processing using DuckDB for efficient handling of large datasets.</w:t>
-      </w:r>
-    </w:p>
-    <w:p>
-      <w:pPr>
-        <w:pStyle w:val="ListBullet"/>
-        <w:spacing w:after="80"/>
-      </w:pPr>
-      <w:r>
-        <w:rPr>
-          <w:rFonts w:ascii="Times New Roman" w:hAnsi="Times New Roman"/>
-          <w:sz w:val="24"/>
-        </w:rPr>
-        <w:t>Automated profiling and quality issue detection.</w:t>
-      </w:r>
-    </w:p>
-    <w:p>
-      <w:pPr>
-        <w:pStyle w:val="ListBullet"/>
-        <w:spacing w:after="80"/>
-      </w:pPr>
-      <w:r>
-        <w:rPr>
-          <w:rFonts w:ascii="Times New Roman" w:hAnsi="Times New Roman"/>
-          <w:sz w:val="24"/>
-        </w:rPr>
-        <w:t>Multi-file and multi-sheet Excel support.</w:t>
-      </w:r>
-    </w:p>
-    <w:p>
-      <w:pPr>
-        <w:pStyle w:val="ListBullet"/>
-        <w:spacing w:after="80"/>
-      </w:pPr>
-      <w:r>
-        <w:rPr>
-          <w:rFonts w:ascii="Times New Roman" w:hAnsi="Times New Roman"/>
-          <w:sz w:val="24"/>
-        </w:rPr>
-        <w:t>Automatic relationship detection with cardinality and confidence scoring.</w:t>
-      </w:r>
-    </w:p>
-    <w:p>
-      <w:pPr>
-        <w:pStyle w:val="ListBullet"/>
-        <w:spacing w:after="80"/>
-      </w:pPr>
-      <w:r>
-        <w:rPr>
-          <w:rFonts w:ascii="Times New Roman" w:hAnsi="Times New Roman"/>
-          <w:sz w:val="24"/>
-        </w:rPr>
-        <w:t>Cross-table analytical queries through the semantic model.</w:t>
-      </w:r>
-    </w:p>
-    <w:p>
-      <w:pPr>
-        <w:pStyle w:val="ListBullet"/>
-        <w:spacing w:after="80"/>
-      </w:pPr>
-      <w:r>
-        <w:rPr>
-          <w:rFonts w:ascii="Times New Roman" w:hAnsi="Times New Roman"/>
-          <w:sz w:val="24"/>
-        </w:rPr>
-        <w:t>Automatic dashboard generation.</w:t>
-      </w:r>
-    </w:p>
-    <w:p>
-      <w:pPr>
-        <w:pStyle w:val="ListBullet"/>
-        <w:spacing w:after="80"/>
-      </w:pPr>
-      <w:r>
-        <w:rPr>
-          <w:rFonts w:ascii="Times New Roman" w:hAnsi="Times New Roman"/>
-          <w:sz w:val="24"/>
-        </w:rPr>
-        <w:t>Reversible data operations with operation history and undo.</w:t>
-      </w:r>
-    </w:p>
-    <w:p>
-      <w:pPr>
-        <w:pStyle w:val="ListBullet"/>
-        <w:spacing w:after="80"/>
-      </w:pPr>
-      <w:r>
-        <w:rPr>
-          <w:rFonts w:ascii="Times New Roman" w:hAnsi="Times New Roman"/>
-          <w:sz w:val="24"/>
-        </w:rPr>
-        <w:t>Export support for CSV, Excel, JSON.</w:t>
-      </w:r>
-    </w:p>
-    <w:p>
-      <w:pPr>
-        <w:pStyle w:val="ListBullet"/>
-        <w:spacing w:after="80"/>
-      </w:pPr>
-      <w:r>
-        <w:rPr>
-          <w:rFonts w:ascii="Times New Roman" w:hAnsi="Times New Roman"/>
-          <w:sz w:val="24"/>
-        </w:rPr>
-        <w:t>Successful testing with a 151 MB dataset containing approximately 2.2 million rows.</w:t>
+        <w:t>● The Cleanlytics project was successfully developed as an integrated platform for data preparation and analysis. The system allows users to upload datasets, analyse their quality, clean and transform data, identify relationships between tables, and generate meaningful visualizations through a single interface. ● The major achievements of the project include successful server-side data processing using DuckDB, allowing the system to handle large datasets efficiently. The platform also provides automated data profiling and quality detection, along with support for multiple files and Excel worksheets. ● Cleanlytics successfully detects relationships between tables and provides cardinality and confidence information, which is further used for cross-table analytical queries through the semantic model. Users can also generate dashboards, perform reversible data operations using operation history and undo, and export processed data in formats such as CSV, Excel, and JSON. ● The system was also tested with a 151 MB dataset containing approximately 2.2 million rows, demonstrating that the platform can handle large datasets while maintaining efficient data processing.</w:t>
       </w:r>
     </w:p>
     <w:p>
@@ -8511,6 +8381,1270 @@
       <w:pPr>
         <w:spacing w:after="80"/>
       </w:pPr>
+    </w:p>
+    <w:p>
+      <w:r>
+        <w:br w:type="page"/>
+      </w:r>
+    </w:p>
+    <w:p>
+      <w:pPr>
+        <w:spacing w:before="0" w:after="200"/>
+      </w:pPr>
+      <w:r>
+        <w:rPr>
+          <w:rFonts w:ascii="Times New Roman" w:hAnsi="Times New Roman"/>
+          <w:b/>
+          <w:sz w:val="28"/>
+        </w:rPr>
+        <w:t>3.3 PLANNING AND SCHEDULING</w:t>
+      </w:r>
+    </w:p>
+    <w:p>
+      <w:pPr>
+        <w:jc w:val="center"/>
+      </w:pPr>
+      <w:r>
+        <w:drawing>
+          <wp:inline xmlns:a="http://schemas.openxmlformats.org/drawingml/2006/main" xmlns:pic="http://schemas.openxmlformats.org/drawingml/2006/picture">
+            <wp:extent cx="5040000" cy="3782347"/>
+            <wp:docPr id="3" name="Picture 3"/>
+            <wp:cNvGraphicFramePr>
+              <a:graphicFrameLocks noChangeAspect="1"/>
+            </wp:cNvGraphicFramePr>
+            <a:graphic>
+              <a:graphicData uri="http://schemas.openxmlformats.org/drawingml/2006/picture">
+                <pic:pic>
+                  <pic:nvPicPr>
+                    <pic:cNvPr id="0" name="fig-3.3.1_pert_chart.png"/>
+                    <pic:cNvPicPr/>
+                  </pic:nvPicPr>
+                  <pic:blipFill>
+                    <a:blip r:embed="rId11"/>
+                    <a:stretch>
+                      <a:fillRect/>
+                    </a:stretch>
+                  </pic:blipFill>
+                  <pic:spPr>
+                    <a:xfrm>
+                      <a:off x="0" y="0"/>
+                      <a:ext cx="5040000" cy="3782347"/>
+                    </a:xfrm>
+                    <a:prstGeom prst="rect"/>
+                  </pic:spPr>
+                </pic:pic>
+              </a:graphicData>
+            </a:graphic>
+          </wp:inline>
+        </w:drawing>
+      </w:r>
+    </w:p>
+    <w:p>
+      <w:pPr>
+        <w:spacing w:after="200"/>
+        <w:jc w:val="center"/>
+      </w:pPr>
+      <w:r>
+        <w:rPr>
+          <w:rFonts w:ascii="Times New Roman" w:hAnsi="Times New Roman"/>
+          <w:b/>
+          <w:sz w:val="24"/>
+        </w:rPr>
+        <w:t>Figure 3.3.1: Pert Chart</w:t>
+      </w:r>
+    </w:p>
+    <w:p>
+      <w:pPr>
+        <w:jc w:val="center"/>
+      </w:pPr>
+      <w:r>
+        <w:drawing>
+          <wp:inline xmlns:a="http://schemas.openxmlformats.org/drawingml/2006/main" xmlns:pic="http://schemas.openxmlformats.org/drawingml/2006/picture">
+            <wp:extent cx="5040000" cy="2378803"/>
+            <wp:docPr id="4" name="Picture 4"/>
+            <wp:cNvGraphicFramePr>
+              <a:graphicFrameLocks noChangeAspect="1"/>
+            </wp:cNvGraphicFramePr>
+            <a:graphic>
+              <a:graphicData uri="http://schemas.openxmlformats.org/drawingml/2006/picture">
+                <pic:pic>
+                  <pic:nvPicPr>
+                    <pic:cNvPr id="0" name="fig-3.3.2_gantt_chart.png"/>
+                    <pic:cNvPicPr/>
+                  </pic:nvPicPr>
+                  <pic:blipFill>
+                    <a:blip r:embed="rId12"/>
+                    <a:stretch>
+                      <a:fillRect/>
+                    </a:stretch>
+                  </pic:blipFill>
+                  <pic:spPr>
+                    <a:xfrm>
+                      <a:off x="0" y="0"/>
+                      <a:ext cx="5040000" cy="2378803"/>
+                    </a:xfrm>
+                    <a:prstGeom prst="rect"/>
+                  </pic:spPr>
+                </pic:pic>
+              </a:graphicData>
+            </a:graphic>
+          </wp:inline>
+        </w:drawing>
+      </w:r>
+    </w:p>
+    <w:p>
+      <w:pPr>
+        <w:spacing w:after="200"/>
+        <w:jc w:val="center"/>
+      </w:pPr>
+      <w:r>
+        <w:rPr>
+          <w:rFonts w:ascii="Times New Roman" w:hAnsi="Times New Roman"/>
+          <w:b/>
+          <w:sz w:val="24"/>
+        </w:rPr>
+        <w:t>Figure 3.3.2: Gantt Chart</w:t>
+      </w:r>
+    </w:p>
+    <w:p>
+      <w:r>
+        <w:br w:type="page"/>
+      </w:r>
+    </w:p>
+    <w:p>
+      <w:pPr>
+        <w:spacing w:before="0" w:after="200"/>
+      </w:pPr>
+      <w:r>
+        <w:rPr>
+          <w:rFonts w:ascii="Times New Roman" w:hAnsi="Times New Roman"/>
+          <w:b/>
+          <w:sz w:val="28"/>
+        </w:rPr>
+        <w:t>3.4 SOFTWARE AND HARDWARE REQUIREMENTS</w:t>
+      </w:r>
+    </w:p>
+    <w:p>
+      <w:pPr>
+        <w:spacing w:before="200" w:after="120"/>
+        <w:ind w:left="360"/>
+      </w:pPr>
+      <w:r>
+        <w:rPr>
+          <w:rFonts w:ascii="Times New Roman" w:hAnsi="Times New Roman"/>
+          <w:b/>
+          <w:sz w:val="28"/>
+        </w:rPr>
+        <w:t>Software Requirements</w:t>
+      </w:r>
+    </w:p>
+    <w:p>
+      <w:pPr>
+        <w:spacing w:before="200" w:after="120"/>
+        <w:ind w:left="360"/>
+      </w:pPr>
+      <w:r>
+        <w:rPr>
+          <w:rFonts w:ascii="Times New Roman" w:hAnsi="Times New Roman"/>
+          <w:b/>
+          <w:sz w:val="28"/>
+        </w:rPr>
+        <w:t>Frontend Technologies</w:t>
+      </w:r>
+    </w:p>
+    <w:p>
+      <w:pPr>
+        <w:pStyle w:val="ListBullet"/>
+        <w:spacing w:after="80"/>
+      </w:pPr>
+      <w:r>
+        <w:rPr>
+          <w:rFonts w:ascii="Times New Roman" w:hAnsi="Times New Roman"/>
+          <w:sz w:val="24"/>
+        </w:rPr>
+        <w:t>Next.js 16.2.9</w:t>
+      </w:r>
+    </w:p>
+    <w:p>
+      <w:pPr>
+        <w:pStyle w:val="ListBullet"/>
+        <w:spacing w:after="80"/>
+      </w:pPr>
+      <w:r>
+        <w:rPr>
+          <w:rFonts w:ascii="Times New Roman" w:hAnsi="Times New Roman"/>
+          <w:sz w:val="24"/>
+        </w:rPr>
+        <w:t>React 19.2.4</w:t>
+      </w:r>
+    </w:p>
+    <w:p>
+      <w:pPr>
+        <w:pStyle w:val="ListBullet"/>
+        <w:spacing w:after="80"/>
+      </w:pPr>
+      <w:r>
+        <w:rPr>
+          <w:rFonts w:ascii="Times New Roman" w:hAnsi="Times New Roman"/>
+          <w:sz w:val="24"/>
+        </w:rPr>
+        <w:t>React DOM 19.2.4</w:t>
+      </w:r>
+    </w:p>
+    <w:p>
+      <w:pPr>
+        <w:pStyle w:val="ListBullet"/>
+        <w:spacing w:after="80"/>
+      </w:pPr>
+      <w:r>
+        <w:rPr>
+          <w:rFonts w:ascii="Times New Roman" w:hAnsi="Times New Roman"/>
+          <w:sz w:val="24"/>
+        </w:rPr>
+        <w:t>TypeScript 5.x</w:t>
+      </w:r>
+    </w:p>
+    <w:p>
+      <w:pPr>
+        <w:pStyle w:val="ListBullet"/>
+        <w:spacing w:after="80"/>
+      </w:pPr>
+      <w:r>
+        <w:rPr>
+          <w:rFonts w:ascii="Times New Roman" w:hAnsi="Times New Roman"/>
+          <w:sz w:val="24"/>
+        </w:rPr>
+        <w:t>Tailwind CSS 4.x</w:t>
+      </w:r>
+    </w:p>
+    <w:p>
+      <w:pPr>
+        <w:pStyle w:val="ListBullet"/>
+        <w:spacing w:after="80"/>
+      </w:pPr>
+      <w:r>
+        <w:rPr>
+          <w:rFonts w:ascii="Times New Roman" w:hAnsi="Times New Roman"/>
+          <w:sz w:val="24"/>
+        </w:rPr>
+        <w:t>Recharts</w:t>
+      </w:r>
+    </w:p>
+    <w:p>
+      <w:pPr>
+        <w:pStyle w:val="ListBullet"/>
+        <w:spacing w:after="80"/>
+      </w:pPr>
+      <w:r>
+        <w:rPr>
+          <w:rFonts w:ascii="Times New Roman" w:hAnsi="Times New Roman"/>
+          <w:sz w:val="24"/>
+        </w:rPr>
+        <w:t>React Grid Layout</w:t>
+      </w:r>
+    </w:p>
+    <w:p>
+      <w:pPr>
+        <w:pStyle w:val="ListBullet"/>
+        <w:spacing w:after="80"/>
+      </w:pPr>
+      <w:r>
+        <w:rPr>
+          <w:rFonts w:ascii="Times New Roman" w:hAnsi="Times New Roman"/>
+          <w:sz w:val="24"/>
+        </w:rPr>
+        <w:t>Lucide React</w:t>
+      </w:r>
+    </w:p>
+    <w:p>
+      <w:pPr>
+        <w:pStyle w:val="ListBullet"/>
+        <w:spacing w:after="80"/>
+      </w:pPr>
+      <w:r>
+        <w:rPr>
+          <w:rFonts w:ascii="Times New Roman" w:hAnsi="Times New Roman"/>
+          <w:sz w:val="24"/>
+        </w:rPr>
+        <w:t>XLSX</w:t>
+      </w:r>
+    </w:p>
+    <w:p>
+      <w:pPr>
+        <w:spacing w:before="200" w:after="120"/>
+        <w:ind w:left="360"/>
+      </w:pPr>
+      <w:r>
+        <w:rPr>
+          <w:rFonts w:ascii="Times New Roman" w:hAnsi="Times New Roman"/>
+          <w:b/>
+          <w:sz w:val="28"/>
+        </w:rPr>
+        <w:t>Backend Technologies</w:t>
+      </w:r>
+    </w:p>
+    <w:p>
+      <w:pPr>
+        <w:pStyle w:val="ListBullet"/>
+        <w:spacing w:after="80"/>
+      </w:pPr>
+      <w:r>
+        <w:rPr>
+          <w:rFonts w:ascii="Times New Roman" w:hAnsi="Times New Roman"/>
+          <w:sz w:val="24"/>
+        </w:rPr>
+        <w:t>Python 3.10+</w:t>
+      </w:r>
+    </w:p>
+    <w:p>
+      <w:pPr>
+        <w:pStyle w:val="ListBullet"/>
+        <w:spacing w:after="80"/>
+      </w:pPr>
+      <w:r>
+        <w:rPr>
+          <w:rFonts w:ascii="Times New Roman" w:hAnsi="Times New Roman"/>
+          <w:sz w:val="24"/>
+        </w:rPr>
+        <w:t>FastAPI</w:t>
+      </w:r>
+    </w:p>
+    <w:p>
+      <w:pPr>
+        <w:pStyle w:val="ListBullet"/>
+        <w:spacing w:after="80"/>
+      </w:pPr>
+      <w:r>
+        <w:rPr>
+          <w:rFonts w:ascii="Times New Roman" w:hAnsi="Times New Roman"/>
+          <w:sz w:val="24"/>
+        </w:rPr>
+        <w:t>Uvicorn</w:t>
+      </w:r>
+    </w:p>
+    <w:p>
+      <w:pPr>
+        <w:pStyle w:val="ListBullet"/>
+        <w:spacing w:after="80"/>
+      </w:pPr>
+      <w:r>
+        <w:rPr>
+          <w:rFonts w:ascii="Times New Roman" w:hAnsi="Times New Roman"/>
+          <w:sz w:val="24"/>
+        </w:rPr>
+        <w:t>Pydantic</w:t>
+      </w:r>
+    </w:p>
+    <w:p>
+      <w:pPr>
+        <w:pStyle w:val="ListBullet"/>
+        <w:spacing w:after="80"/>
+      </w:pPr>
+      <w:r>
+        <w:rPr>
+          <w:rFonts w:ascii="Times New Roman" w:hAnsi="Times New Roman"/>
+          <w:sz w:val="24"/>
+        </w:rPr>
+        <w:t>DuckDB</w:t>
+      </w:r>
+    </w:p>
+    <w:p>
+      <w:pPr>
+        <w:pStyle w:val="ListBullet"/>
+        <w:spacing w:after="80"/>
+      </w:pPr>
+      <w:r>
+        <w:rPr>
+          <w:rFonts w:ascii="Times New Roman" w:hAnsi="Times New Roman"/>
+          <w:sz w:val="24"/>
+        </w:rPr>
+        <w:t>Pandas</w:t>
+      </w:r>
+    </w:p>
+    <w:p>
+      <w:pPr>
+        <w:pStyle w:val="ListBullet"/>
+        <w:spacing w:after="80"/>
+      </w:pPr>
+      <w:r>
+        <w:rPr>
+          <w:rFonts w:ascii="Times New Roman" w:hAnsi="Times New Roman"/>
+          <w:sz w:val="24"/>
+        </w:rPr>
+        <w:t>OpenPyXL</w:t>
+      </w:r>
+    </w:p>
+    <w:p>
+      <w:pPr>
+        <w:pStyle w:val="ListBullet"/>
+        <w:spacing w:after="80"/>
+      </w:pPr>
+      <w:r>
+        <w:rPr>
+          <w:rFonts w:ascii="Times New Roman" w:hAnsi="Times New Roman"/>
+          <w:sz w:val="24"/>
+        </w:rPr>
+        <w:t>SQLAlchemy</w:t>
+      </w:r>
+    </w:p>
+    <w:p>
+      <w:pPr>
+        <w:pStyle w:val="ListBullet"/>
+        <w:spacing w:after="80"/>
+      </w:pPr>
+      <w:r>
+        <w:rPr>
+          <w:rFonts w:ascii="Times New Roman" w:hAnsi="Times New Roman"/>
+          <w:sz w:val="24"/>
+        </w:rPr>
+        <w:t>PyJWT</w:t>
+      </w:r>
+    </w:p>
+    <w:p>
+      <w:pPr>
+        <w:spacing w:before="200" w:after="120"/>
+        <w:ind w:left="360"/>
+      </w:pPr>
+      <w:r>
+        <w:rPr>
+          <w:rFonts w:ascii="Times New Roman" w:hAnsi="Times New Roman"/>
+          <w:b/>
+          <w:sz w:val="28"/>
+        </w:rPr>
+        <w:t>Database &amp; Authentication Technologies</w:t>
+      </w:r>
+    </w:p>
+    <w:p>
+      <w:pPr>
+        <w:pStyle w:val="ListBullet"/>
+        <w:spacing w:after="80"/>
+      </w:pPr>
+      <w:r>
+        <w:rPr>
+          <w:rFonts w:ascii="Times New Roman" w:hAnsi="Times New Roman"/>
+          <w:sz w:val="24"/>
+        </w:rPr>
+        <w:t>Supabase</w:t>
+      </w:r>
+    </w:p>
+    <w:p>
+      <w:pPr>
+        <w:pStyle w:val="ListBullet"/>
+        <w:spacing w:after="80"/>
+      </w:pPr>
+      <w:r>
+        <w:rPr>
+          <w:rFonts w:ascii="Times New Roman" w:hAnsi="Times New Roman"/>
+          <w:sz w:val="24"/>
+        </w:rPr>
+        <w:t>PostgreSQL 15+</w:t>
+      </w:r>
+    </w:p>
+    <w:p>
+      <w:pPr>
+        <w:pStyle w:val="ListBullet"/>
+        <w:spacing w:after="80"/>
+      </w:pPr>
+      <w:r>
+        <w:rPr>
+          <w:rFonts w:ascii="Times New Roman" w:hAnsi="Times New Roman"/>
+          <w:sz w:val="24"/>
+        </w:rPr>
+        <w:t>Supabase JavaScript Client</w:t>
+      </w:r>
+    </w:p>
+    <w:p>
+      <w:pPr>
+        <w:pStyle w:val="ListBullet"/>
+        <w:spacing w:after="80"/>
+      </w:pPr>
+      <w:r>
+        <w:rPr>
+          <w:rFonts w:ascii="Times New Roman" w:hAnsi="Times New Roman"/>
+          <w:sz w:val="24"/>
+        </w:rPr>
+        <w:t>Supabase SSR</w:t>
+      </w:r>
+    </w:p>
+    <w:p>
+      <w:pPr>
+        <w:spacing w:before="200" w:after="120"/>
+        <w:ind w:left="360"/>
+      </w:pPr>
+      <w:r>
+        <w:rPr>
+          <w:rFonts w:ascii="Times New Roman" w:hAnsi="Times New Roman"/>
+          <w:b/>
+          <w:sz w:val="28"/>
+        </w:rPr>
+        <w:t>Development Tools</w:t>
+      </w:r>
+    </w:p>
+    <w:p>
+      <w:pPr>
+        <w:pStyle w:val="ListBullet"/>
+        <w:spacing w:after="80"/>
+      </w:pPr>
+      <w:r>
+        <w:rPr>
+          <w:rFonts w:ascii="Times New Roman" w:hAnsi="Times New Roman"/>
+          <w:sz w:val="24"/>
+        </w:rPr>
+        <w:t>Node.js 18+</w:t>
+      </w:r>
+    </w:p>
+    <w:p>
+      <w:pPr>
+        <w:pStyle w:val="ListBullet"/>
+        <w:spacing w:after="80"/>
+      </w:pPr>
+      <w:r>
+        <w:rPr>
+          <w:rFonts w:ascii="Times New Roman" w:hAnsi="Times New Roman"/>
+          <w:sz w:val="24"/>
+        </w:rPr>
+        <w:t>npm 9+</w:t>
+      </w:r>
+    </w:p>
+    <w:p>
+      <w:pPr>
+        <w:pStyle w:val="ListBullet"/>
+        <w:spacing w:after="80"/>
+      </w:pPr>
+      <w:r>
+        <w:rPr>
+          <w:rFonts w:ascii="Times New Roman" w:hAnsi="Times New Roman"/>
+          <w:sz w:val="24"/>
+        </w:rPr>
+        <w:t>Git</w:t>
+      </w:r>
+    </w:p>
+    <w:p>
+      <w:pPr>
+        <w:pStyle w:val="ListBullet"/>
+        <w:spacing w:after="80"/>
+      </w:pPr>
+      <w:r>
+        <w:rPr>
+          <w:rFonts w:ascii="Times New Roman" w:hAnsi="Times New Roman"/>
+          <w:sz w:val="24"/>
+        </w:rPr>
+        <w:t>Visual Studio Code</w:t>
+      </w:r>
+    </w:p>
+    <w:p>
+      <w:pPr>
+        <w:pStyle w:val="ListBullet"/>
+        <w:spacing w:after="80"/>
+      </w:pPr>
+      <w:r>
+        <w:rPr>
+          <w:rFonts w:ascii="Times New Roman" w:hAnsi="Times New Roman"/>
+          <w:sz w:val="24"/>
+        </w:rPr>
+        <w:t>ESLint</w:t>
+      </w:r>
+    </w:p>
+    <w:p>
+      <w:pPr>
+        <w:pStyle w:val="ListBullet"/>
+        <w:spacing w:after="80"/>
+      </w:pPr>
+      <w:r>
+        <w:rPr>
+          <w:rFonts w:ascii="Times New Roman" w:hAnsi="Times New Roman"/>
+          <w:sz w:val="24"/>
+        </w:rPr>
+        <w:t>Postman / Thunder Client</w:t>
+      </w:r>
+    </w:p>
+    <w:p>
+      <w:pPr>
+        <w:spacing w:before="200" w:after="120"/>
+        <w:ind w:left="360"/>
+      </w:pPr>
+      <w:r>
+        <w:rPr>
+          <w:rFonts w:ascii="Times New Roman" w:hAnsi="Times New Roman"/>
+          <w:b/>
+          <w:sz w:val="28"/>
+        </w:rPr>
+        <w:t>Operating System &amp; Browser</w:t>
+      </w:r>
+    </w:p>
+    <w:p>
+      <w:pPr>
+        <w:pStyle w:val="ListBullet"/>
+        <w:spacing w:after="80"/>
+      </w:pPr>
+      <w:r>
+        <w:rPr>
+          <w:rFonts w:ascii="Times New Roman" w:hAnsi="Times New Roman"/>
+          <w:sz w:val="24"/>
+        </w:rPr>
+        <w:t>Windows 10/11, macOS 12+ or Ubuntu 20.04+</w:t>
+      </w:r>
+    </w:p>
+    <w:p>
+      <w:pPr>
+        <w:pStyle w:val="ListBullet"/>
+        <w:spacing w:after="80"/>
+      </w:pPr>
+      <w:r>
+        <w:rPr>
+          <w:rFonts w:ascii="Times New Roman" w:hAnsi="Times New Roman"/>
+          <w:sz w:val="24"/>
+        </w:rPr>
+        <w:t>Google Chrome, Microsoft Edge, Firefox or Safari</w:t>
+      </w:r>
+    </w:p>
+    <w:p>
+      <w:pPr>
+        <w:spacing w:before="200" w:after="120"/>
+        <w:ind w:left="360"/>
+      </w:pPr>
+      <w:r>
+        <w:rPr>
+          <w:rFonts w:ascii="Times New Roman" w:hAnsi="Times New Roman"/>
+          <w:b/>
+          <w:sz w:val="28"/>
+        </w:rPr>
+        <w:t>Hardware Requirements</w:t>
+      </w:r>
+    </w:p>
+    <w:p>
+      <w:pPr>
+        <w:spacing w:before="200" w:after="120"/>
+        <w:ind w:left="360"/>
+      </w:pPr>
+      <w:r>
+        <w:rPr>
+          <w:rFonts w:ascii="Times New Roman" w:hAnsi="Times New Roman"/>
+          <w:b/>
+          <w:sz w:val="28"/>
+        </w:rPr>
+        <w:t>Development Workstation</w:t>
+      </w:r>
+    </w:p>
+    <w:p>
+      <w:pPr>
+        <w:pStyle w:val="ListBullet"/>
+        <w:spacing w:after="80"/>
+      </w:pPr>
+      <w:r>
+        <w:rPr>
+          <w:rFonts w:ascii="Times New Roman" w:hAnsi="Times New Roman"/>
+          <w:b/>
+          <w:sz w:val="24"/>
+        </w:rPr>
+        <w:t>Processor:</w:t>
+      </w:r>
+      <w:r>
+        <w:rPr>
+          <w:rFonts w:ascii="Times New Roman" w:hAnsi="Times New Roman"/>
+          <w:sz w:val="24"/>
+        </w:rPr>
+        <w:t xml:space="preserve"> Intel Core i3 / AMD Ryzen 3 or higher</w:t>
+      </w:r>
+    </w:p>
+    <w:p>
+      <w:pPr>
+        <w:pStyle w:val="ListBullet"/>
+        <w:spacing w:after="80"/>
+      </w:pPr>
+      <w:r>
+        <w:rPr>
+          <w:rFonts w:ascii="Times New Roman" w:hAnsi="Times New Roman"/>
+          <w:b/>
+          <w:sz w:val="24"/>
+        </w:rPr>
+        <w:t>RAM:</w:t>
+      </w:r>
+      <w:r>
+        <w:rPr>
+          <w:rFonts w:ascii="Times New Roman" w:hAnsi="Times New Roman"/>
+          <w:sz w:val="24"/>
+        </w:rPr>
+        <w:t xml:space="preserve"> Minimum 8 GB, recommended 16 GB</w:t>
+      </w:r>
+    </w:p>
+    <w:p>
+      <w:pPr>
+        <w:pStyle w:val="ListBullet"/>
+        <w:spacing w:after="80"/>
+      </w:pPr>
+      <w:r>
+        <w:rPr>
+          <w:rFonts w:ascii="Times New Roman" w:hAnsi="Times New Roman"/>
+          <w:b/>
+          <w:sz w:val="24"/>
+        </w:rPr>
+        <w:t>Storage:</w:t>
+      </w:r>
+      <w:r>
+        <w:rPr>
+          <w:rFonts w:ascii="Times New Roman" w:hAnsi="Times New Roman"/>
+          <w:sz w:val="24"/>
+        </w:rPr>
+        <w:t xml:space="preserve"> Minimum 20 GB free space, SSD recommended</w:t>
+      </w:r>
+    </w:p>
+    <w:p>
+      <w:pPr>
+        <w:pStyle w:val="ListBullet"/>
+        <w:spacing w:after="80"/>
+      </w:pPr>
+      <w:r>
+        <w:rPr>
+          <w:rFonts w:ascii="Times New Roman" w:hAnsi="Times New Roman"/>
+          <w:b/>
+          <w:sz w:val="24"/>
+        </w:rPr>
+        <w:t>Display:</w:t>
+      </w:r>
+      <w:r>
+        <w:rPr>
+          <w:rFonts w:ascii="Times New Roman" w:hAnsi="Times New Roman"/>
+          <w:sz w:val="24"/>
+        </w:rPr>
+        <w:t xml:space="preserve"> 1280 x 720 minimum, Full HD recommended</w:t>
+      </w:r>
+    </w:p>
+    <w:p>
+      <w:pPr>
+        <w:pStyle w:val="ListBullet"/>
+        <w:spacing w:after="80"/>
+      </w:pPr>
+      <w:r>
+        <w:rPr>
+          <w:rFonts w:ascii="Times New Roman" w:hAnsi="Times New Roman"/>
+          <w:b/>
+          <w:sz w:val="24"/>
+        </w:rPr>
+        <w:t>Network:</w:t>
+      </w:r>
+      <w:r>
+        <w:rPr>
+          <w:rFonts w:ascii="Times New Roman" w:hAnsi="Times New Roman"/>
+          <w:sz w:val="24"/>
+        </w:rPr>
+        <w:t xml:space="preserve"> Stable broadband internet connection</w:t>
+      </w:r>
+    </w:p>
+    <w:p>
+      <w:pPr>
+        <w:pStyle w:val="ListBullet"/>
+        <w:spacing w:after="80"/>
+      </w:pPr>
+      <w:r>
+        <w:rPr>
+          <w:rFonts w:ascii="Times New Roman" w:hAnsi="Times New Roman"/>
+          <w:b/>
+          <w:sz w:val="24"/>
+        </w:rPr>
+        <w:t>Graphics:</w:t>
+      </w:r>
+      <w:r>
+        <w:rPr>
+          <w:rFonts w:ascii="Times New Roman" w:hAnsi="Times New Roman"/>
+          <w:sz w:val="24"/>
+        </w:rPr>
+        <w:t xml:space="preserve"> Integrated graphics sufficient</w:t>
+      </w:r>
+    </w:p>
+    <w:p>
+      <w:pPr>
+        <w:spacing w:before="200" w:after="120"/>
+        <w:ind w:left="360"/>
+      </w:pPr>
+      <w:r>
+        <w:rPr>
+          <w:rFonts w:ascii="Times New Roman" w:hAnsi="Times New Roman"/>
+          <w:b/>
+          <w:sz w:val="28"/>
+        </w:rPr>
+        <w:t>Server / Deployment Requirements</w:t>
+      </w:r>
+    </w:p>
+    <w:p>
+      <w:pPr>
+        <w:pStyle w:val="ListBullet"/>
+        <w:spacing w:after="80"/>
+      </w:pPr>
+      <w:r>
+        <w:rPr>
+          <w:rFonts w:ascii="Times New Roman" w:hAnsi="Times New Roman"/>
+          <w:b/>
+          <w:sz w:val="24"/>
+        </w:rPr>
+        <w:t>Processor:</w:t>
+      </w:r>
+      <w:r>
+        <w:rPr>
+          <w:rFonts w:ascii="Times New Roman" w:hAnsi="Times New Roman"/>
+          <w:sz w:val="24"/>
+        </w:rPr>
+        <w:t xml:space="preserve"> Minimum 2 vCPU, recommended 4 vCPU</w:t>
+      </w:r>
+    </w:p>
+    <w:p>
+      <w:pPr>
+        <w:pStyle w:val="ListBullet"/>
+        <w:spacing w:after="80"/>
+      </w:pPr>
+      <w:r>
+        <w:rPr>
+          <w:rFonts w:ascii="Times New Roman" w:hAnsi="Times New Roman"/>
+          <w:b/>
+          <w:sz w:val="24"/>
+        </w:rPr>
+        <w:t>RAM:</w:t>
+      </w:r>
+      <w:r>
+        <w:rPr>
+          <w:rFonts w:ascii="Times New Roman" w:hAnsi="Times New Roman"/>
+          <w:sz w:val="24"/>
+        </w:rPr>
+        <w:t xml:space="preserve"> Minimum 4 GB, recommended 8 GB or higher</w:t>
+      </w:r>
+    </w:p>
+    <w:p>
+      <w:pPr>
+        <w:pStyle w:val="ListBullet"/>
+        <w:spacing w:after="80"/>
+      </w:pPr>
+      <w:r>
+        <w:rPr>
+          <w:rFonts w:ascii="Times New Roman" w:hAnsi="Times New Roman"/>
+          <w:b/>
+          <w:sz w:val="24"/>
+        </w:rPr>
+        <w:t>Storage:</w:t>
+      </w:r>
+      <w:r>
+        <w:rPr>
+          <w:rFonts w:ascii="Times New Roman" w:hAnsi="Times New Roman"/>
+          <w:sz w:val="24"/>
+        </w:rPr>
+        <w:t xml:space="preserve"> Minimum 20 GB SSD, recommended 50 GB SSD</w:t>
+      </w:r>
+    </w:p>
+    <w:p>
+      <w:pPr>
+        <w:pStyle w:val="ListBullet"/>
+        <w:spacing w:after="80"/>
+      </w:pPr>
+      <w:r>
+        <w:rPr>
+          <w:rFonts w:ascii="Times New Roman" w:hAnsi="Times New Roman"/>
+          <w:b/>
+          <w:sz w:val="24"/>
+        </w:rPr>
+        <w:t>Network:</w:t>
+      </w:r>
+      <w:r>
+        <w:rPr>
+          <w:rFonts w:ascii="Times New Roman" w:hAnsi="Times New Roman"/>
+          <w:sz w:val="24"/>
+        </w:rPr>
+        <w:t xml:space="preserve"> Stable high-speed internet connection</w:t>
+      </w:r>
+    </w:p>
+    <w:p>
+      <w:pPr>
+        <w:pStyle w:val="ListBullet"/>
+        <w:spacing w:after="80"/>
+      </w:pPr>
+      <w:r>
+        <w:rPr>
+          <w:rFonts w:ascii="Times New Roman" w:hAnsi="Times New Roman"/>
+          <w:b/>
+          <w:sz w:val="24"/>
+        </w:rPr>
+        <w:t>Operating System:</w:t>
+      </w:r>
+      <w:r>
+        <w:rPr>
+          <w:rFonts w:ascii="Times New Roman" w:hAnsi="Times New Roman"/>
+          <w:sz w:val="24"/>
+        </w:rPr>
+        <w:t xml:space="preserve"> Ubuntu 20.04 LTS or later</w:t>
+      </w:r>
+    </w:p>
+    <w:p>
+      <w:r>
+        <w:br w:type="page"/>
+      </w:r>
+    </w:p>
+    <w:p>
+      <w:pPr>
+        <w:spacing w:before="0" w:after="200"/>
+      </w:pPr>
+      <w:r>
+        <w:rPr>
+          <w:rFonts w:ascii="Times New Roman" w:hAnsi="Times New Roman"/>
+          <w:b/>
+          <w:sz w:val="28"/>
+        </w:rPr>
+        <w:t>3.5 PRELIMINARY PRODUCT DESCRIPTION</w:t>
+      </w:r>
+    </w:p>
+    <w:p>
+      <w:pPr>
+        <w:pStyle w:val="ListBullet"/>
+        <w:spacing w:after="80"/>
+      </w:pPr>
+      <w:r>
+        <w:rPr>
+          <w:rFonts w:ascii="Times New Roman" w:hAnsi="Times New Roman"/>
+          <w:b/>
+          <w:sz w:val="24"/>
+        </w:rPr>
+        <w:t>Secure Authentication:</w:t>
+      </w:r>
+      <w:r>
+        <w:rPr>
+          <w:rFonts w:ascii="Times New Roman" w:hAnsi="Times New Roman"/>
+          <w:sz w:val="24"/>
+        </w:rPr>
+        <w:t xml:space="preserve"> Provides secure user authentication through Supabase Authentication and maintains separate access to user projects and datasets.</w:t>
+      </w:r>
+    </w:p>
+    <w:p>
+      <w:pPr>
+        <w:pStyle w:val="ListBullet"/>
+        <w:spacing w:after="80"/>
+      </w:pPr>
+      <w:r>
+        <w:rPr>
+          <w:rFonts w:ascii="Times New Roman" w:hAnsi="Times New Roman"/>
+          <w:b/>
+          <w:sz w:val="24"/>
+        </w:rPr>
+        <w:t>Project Management:</w:t>
+      </w:r>
+      <w:r>
+        <w:rPr>
+          <w:rFonts w:ascii="Times New Roman" w:hAnsi="Times New Roman"/>
+          <w:sz w:val="24"/>
+        </w:rPr>
+        <w:t xml:space="preserve"> Allows users to create and manage projects for organizing multiple datasets.</w:t>
+      </w:r>
+    </w:p>
+    <w:p>
+      <w:pPr>
+        <w:pStyle w:val="ListBullet"/>
+        <w:spacing w:after="80"/>
+      </w:pPr>
+      <w:r>
+        <w:rPr>
+          <w:rFonts w:ascii="Times New Roman" w:hAnsi="Times New Roman"/>
+          <w:b/>
+          <w:sz w:val="24"/>
+        </w:rPr>
+        <w:t>Data Upload:</w:t>
+      </w:r>
+      <w:r>
+        <w:rPr>
+          <w:rFonts w:ascii="Times New Roman" w:hAnsi="Times New Roman"/>
+          <w:sz w:val="24"/>
+        </w:rPr>
+        <w:t xml:space="preserve"> Supports uploading CSV, TSV, Excel, and Parquet files for data analysis.</w:t>
+      </w:r>
+    </w:p>
+    <w:p>
+      <w:pPr>
+        <w:pStyle w:val="ListBullet"/>
+        <w:spacing w:after="80"/>
+      </w:pPr>
+      <w:r>
+        <w:rPr>
+          <w:rFonts w:ascii="Times New Roman" w:hAnsi="Times New Roman"/>
+          <w:b/>
+          <w:sz w:val="24"/>
+        </w:rPr>
+        <w:t>Data Profiling:</w:t>
+      </w:r>
+      <w:r>
+        <w:rPr>
+          <w:rFonts w:ascii="Times New Roman" w:hAnsi="Times New Roman"/>
+          <w:sz w:val="24"/>
+        </w:rPr>
+        <w:t xml:space="preserve"> Automatically analyzes uploaded datasets and displays information such as row count, column count, data types, missing values, duplicate records, and unique values.</w:t>
+      </w:r>
+    </w:p>
+    <w:p>
+      <w:pPr>
+        <w:pStyle w:val="ListBullet"/>
+        <w:spacing w:after="80"/>
+      </w:pPr>
+      <w:r>
+        <w:rPr>
+          <w:rFonts w:ascii="Times New Roman" w:hAnsi="Times New Roman"/>
+          <w:b/>
+          <w:sz w:val="24"/>
+        </w:rPr>
+        <w:t>Data Quality Analysis:</w:t>
+      </w:r>
+      <w:r>
+        <w:rPr>
+          <w:rFonts w:ascii="Times New Roman" w:hAnsi="Times New Roman"/>
+          <w:sz w:val="24"/>
+        </w:rPr>
+        <w:t xml:space="preserve"> Automatically identifies common data quality issues and presents the findings according to their severity.</w:t>
+      </w:r>
+    </w:p>
+    <w:p>
+      <w:pPr>
+        <w:pStyle w:val="ListBullet"/>
+        <w:spacing w:after="80"/>
+      </w:pPr>
+      <w:r>
+        <w:rPr>
+          <w:rFonts w:ascii="Times New Roman" w:hAnsi="Times New Roman"/>
+          <w:b/>
+          <w:sz w:val="24"/>
+        </w:rPr>
+        <w:t>Data Cleaning:</w:t>
+      </w:r>
+      <w:r>
+        <w:rPr>
+          <w:rFonts w:ascii="Times New Roman" w:hAnsi="Times New Roman"/>
+          <w:sz w:val="24"/>
+        </w:rPr>
+        <w:t xml:space="preserve"> Provides no-code operations for handling missing values, removing duplicates, renaming or deleting columns, changing data types, filtering rows, and performing string and numeric transformations.</w:t>
+      </w:r>
+    </w:p>
+    <w:p>
+      <w:pPr>
+        <w:pStyle w:val="ListBullet"/>
+        <w:spacing w:after="80"/>
+      </w:pPr>
+      <w:r>
+        <w:rPr>
+          <w:rFonts w:ascii="Times New Roman" w:hAnsi="Times New Roman"/>
+          <w:b/>
+          <w:sz w:val="24"/>
+        </w:rPr>
+        <w:t>Operation History:</w:t>
+      </w:r>
+      <w:r>
+        <w:rPr>
+          <w:rFonts w:ascii="Times New Roman" w:hAnsi="Times New Roman"/>
+          <w:sz w:val="24"/>
+        </w:rPr>
+        <w:t xml:space="preserve"> Maintains a history of cleaning operations and allows users to undo previous changes.</w:t>
+      </w:r>
+    </w:p>
+    <w:p>
+      <w:pPr>
+        <w:pStyle w:val="ListBullet"/>
+        <w:spacing w:after="80"/>
+      </w:pPr>
+      <w:r>
+        <w:rPr>
+          <w:rFonts w:ascii="Times New Roman" w:hAnsi="Times New Roman"/>
+          <w:b/>
+          <w:sz w:val="24"/>
+        </w:rPr>
+        <w:t>Relationship Detection:</w:t>
+      </w:r>
+      <w:r>
+        <w:rPr>
+          <w:rFonts w:ascii="Times New Roman" w:hAnsi="Times New Roman"/>
+          <w:sz w:val="24"/>
+        </w:rPr>
+        <w:t xml:space="preserve"> Identifies possible relationships between different tables by analyzing column names, values, and data patterns.</w:t>
+      </w:r>
+    </w:p>
+    <w:p>
+      <w:pPr>
+        <w:pStyle w:val="ListBullet"/>
+        <w:spacing w:after="80"/>
+      </w:pPr>
+      <w:r>
+        <w:rPr>
+          <w:rFonts w:ascii="Times New Roman" w:hAnsi="Times New Roman"/>
+          <w:b/>
+          <w:sz w:val="24"/>
+        </w:rPr>
+        <w:t>Semantic Model:</w:t>
+      </w:r>
+      <w:r>
+        <w:rPr>
+          <w:rFonts w:ascii="Times New Roman" w:hAnsi="Times New Roman"/>
+          <w:sz w:val="24"/>
+        </w:rPr>
+        <w:t xml:space="preserve"> Provides a logical view of related tables and allows users to approve, reject, or define relationships manually.</w:t>
+      </w:r>
+    </w:p>
+    <w:p>
+      <w:pPr>
+        <w:pStyle w:val="ListBullet"/>
+        <w:spacing w:after="80"/>
+      </w:pPr>
+      <w:r>
+        <w:rPr>
+          <w:rFonts w:ascii="Times New Roman" w:hAnsi="Times New Roman"/>
+          <w:b/>
+          <w:sz w:val="24"/>
+        </w:rPr>
+        <w:t>Auto Dashboard:</w:t>
+      </w:r>
+      <w:r>
+        <w:rPr>
+          <w:rFonts w:ascii="Times New Roman" w:hAnsi="Times New Roman"/>
+          <w:sz w:val="24"/>
+        </w:rPr>
+        <w:t xml:space="preserve"> Automatically generates suitable charts, KPI cards, and summary tables based on the uploaded data.</w:t>
+      </w:r>
+    </w:p>
+    <w:p>
+      <w:pPr>
+        <w:pStyle w:val="ListBullet"/>
+        <w:spacing w:after="80"/>
+      </w:pPr>
+      <w:r>
+        <w:rPr>
+          <w:rFonts w:ascii="Times New Roman" w:hAnsi="Times New Roman"/>
+          <w:b/>
+          <w:sz w:val="24"/>
+        </w:rPr>
+        <w:t>Dashboard Builder:</w:t>
+      </w:r>
+      <w:r>
+        <w:rPr>
+          <w:rFonts w:ascii="Times New Roman" w:hAnsi="Times New Roman"/>
+          <w:sz w:val="24"/>
+        </w:rPr>
+        <w:t xml:space="preserve"> Allows users to create customized dashboards by adding, resizing, arranging, and configuring different visualization components.</w:t>
+      </w:r>
+    </w:p>
+    <w:p>
+      <w:pPr>
+        <w:pStyle w:val="ListBullet"/>
+        <w:spacing w:after="80"/>
+      </w:pPr>
+      <w:r>
+        <w:rPr>
+          <w:rFonts w:ascii="Times New Roman" w:hAnsi="Times New Roman"/>
+          <w:b/>
+          <w:sz w:val="24"/>
+        </w:rPr>
+        <w:t>Data Visualization:</w:t>
+      </w:r>
+      <w:r>
+        <w:rPr>
+          <w:rFonts w:ascii="Times New Roman" w:hAnsi="Times New Roman"/>
+          <w:sz w:val="24"/>
+        </w:rPr>
+        <w:t xml:space="preserve"> Provides bar charts, line charts, pie/donut charts, scatter plots, KPI cards, and data tables for interactive analysis.</w:t>
+      </w:r>
+    </w:p>
+    <w:p>
+      <w:pPr>
+        <w:pStyle w:val="ListBullet"/>
+        <w:spacing w:after="80"/>
+      </w:pPr>
+      <w:r>
+        <w:rPr>
+          <w:rFonts w:ascii="Times New Roman" w:hAnsi="Times New Roman"/>
+          <w:b/>
+          <w:sz w:val="24"/>
+        </w:rPr>
+        <w:t>Query Engine:</w:t>
+      </w:r>
+      <w:r>
+        <w:rPr>
+          <w:rFonts w:ascii="Times New Roman" w:hAnsi="Times New Roman"/>
+          <w:sz w:val="24"/>
+        </w:rPr>
+        <w:t xml:space="preserve"> Uses DuckDB for efficient analytical query execution and supports analysis of large datasets without transferring complete datasets to the browser.</w:t>
+      </w:r>
+    </w:p>
+    <w:p>
+      <w:pPr>
+        <w:pStyle w:val="ListBullet"/>
+        <w:spacing w:after="80"/>
+      </w:pPr>
+      <w:r>
+        <w:rPr>
+          <w:rFonts w:ascii="Times New Roman" w:hAnsi="Times New Roman"/>
+          <w:b/>
+          <w:sz w:val="24"/>
+        </w:rPr>
+        <w:t>Report Generation:</w:t>
+      </w:r>
+      <w:r>
+        <w:rPr>
+          <w:rFonts w:ascii="Times New Roman" w:hAnsi="Times New Roman"/>
+          <w:sz w:val="24"/>
+        </w:rPr>
+        <w:t xml:space="preserve"> Allows users to export cleaned datasets and analytical results in CSV, XLSX, JSON, and Parquet formats.</w:t>
+      </w:r>
+    </w:p>
+    <w:p>
+      <w:pPr>
+        <w:pStyle w:val="ListBullet"/>
+        <w:spacing w:after="80"/>
+      </w:pPr>
+      <w:r>
+        <w:rPr>
+          <w:rFonts w:ascii="Times New Roman" w:hAnsi="Times New Roman"/>
+          <w:b/>
+          <w:sz w:val="24"/>
+        </w:rPr>
+        <w:t>User-Friendly Interface:</w:t>
+      </w:r>
+      <w:r>
+        <w:rPr>
+          <w:rFonts w:ascii="Times New Roman" w:hAnsi="Times New Roman"/>
+          <w:sz w:val="24"/>
+        </w:rPr>
+        <w:t xml:space="preserve"> Provides a clean and simple interface that allows users to perform data analysis and cleaning without requiring programming knowledge.</w:t>
+      </w:r>
+    </w:p>
+    <w:p>
+      <w:pPr>
+        <w:pStyle w:val="ListBullet"/>
+        <w:spacing w:after="80"/>
+      </w:pPr>
+      <w:r>
+        <w:rPr>
+          <w:rFonts w:ascii="Times New Roman" w:hAnsi="Times New Roman"/>
+          <w:b/>
+          <w:sz w:val="24"/>
+        </w:rPr>
+        <w:t>Responsive Interface:</w:t>
+      </w:r>
+      <w:r>
+        <w:rPr>
+          <w:rFonts w:ascii="Times New Roman" w:hAnsi="Times New Roman"/>
+          <w:sz w:val="24"/>
+        </w:rPr>
+        <w:t xml:space="preserve"> Provides a consistent user experience across desktops, laptops, and tablets.</w:t>
+      </w:r>
+    </w:p>
+    <w:p>
+      <w:pPr>
+        <w:pStyle w:val="ListBullet"/>
+        <w:spacing w:after="80"/>
+      </w:pPr>
+      <w:r>
+        <w:rPr>
+          <w:rFonts w:ascii="Times New Roman" w:hAnsi="Times New Roman"/>
+          <w:b/>
+          <w:sz w:val="24"/>
+        </w:rPr>
+        <w:t>Integrated Analytics:</w:t>
+      </w:r>
+      <w:r>
+        <w:rPr>
+          <w:rFonts w:ascii="Times New Roman" w:hAnsi="Times New Roman"/>
+          <w:sz w:val="24"/>
+        </w:rPr>
+        <w:t xml:space="preserve"> Combines data uploading, profiling, cleaning, relationship detection, visualization, dashboard creation, and reporting within a single platform.</w:t>
+      </w:r>
     </w:p>
     <w:sectPr>
       <w:footerReference w:type="default" r:id="rId9"/>

</xml_diff>